<commit_message>
Add live portfolio URL to resume
</commit_message>
<xml_diff>
--- a/assets/Tan-Chun_Wang_Resume.docx
+++ b/assets/Tan-Chun_Wang_Resume.docx
@@ -58,60 +58,60 @@
           <w:color w:val="000000"/>
         </w:rPr>
       </w:pPr>
-      <w:r>
-        <w:rPr>
-          <w:rFonts w:ascii="Times New Roman" w:hAnsi="Times New Roman" w:cs="Times New Roman" w:hint="eastAsia"/>
-        </w:rPr>
-        <w:t>ginaintas</w:t>
-      </w:r>
-      <w:r>
-        <w:rPr>
-          <w:rFonts w:ascii="Times New Roman" w:eastAsia="Times New Roman" w:hAnsi="Times New Roman" w:cs="Times New Roman"/>
-        </w:rPr>
-        <w:t>@</w:t>
-      </w:r>
-      <w:r>
-        <w:rPr>
-          <w:rFonts w:ascii="Times New Roman" w:hAnsi="Times New Roman" w:cs="Times New Roman" w:hint="eastAsia"/>
-        </w:rPr>
-        <w:t>gmail.</w:t>
-      </w:r>
-      <w:r>
-        <w:rPr>
-          <w:rFonts w:ascii="Times New Roman" w:eastAsia="Times New Roman" w:hAnsi="Times New Roman" w:cs="Times New Roman"/>
-        </w:rPr>
-        <w:t>com</w:t>
-      </w:r>
-      <w:r>
-        <w:t xml:space="preserve"> </w:t>
-      </w:r>
-      <w:r>
-        <w:rPr>
-          <w:rFonts w:ascii="Times New Roman" w:eastAsia="Times New Roman" w:hAnsi="Times New Roman" w:cs="Times New Roman"/>
-        </w:rPr>
-        <w:t xml:space="preserve">| </w:t>
-      </w:r>
-      <w:hyperlink r:id="rId8" w:history="1">
+      <w:hyperlink r:id="rId11">
         <w:r>
           <w:rPr>
-            <w:rStyle w:val="af3"/>
-            <w:rFonts w:ascii="Times New Roman" w:eastAsia="Times New Roman" w:hAnsi="Times New Roman" w:cs="Times New Roman"/>
+            <w:rStyle w:val="Hyperlink"/>
+            <w:rFonts w:ascii="Times New Roman" w:hAnsi="Times New Roman"/>
+          </w:rPr>
+          <w:t>ginaintas@gmail.com</w:t>
+        </w:r>
+      </w:hyperlink>
+      <w:r>
+        <w:rPr>
+          <w:rFonts w:ascii="Times New Roman" w:hAnsi="Times New Roman"/>
+        </w:rPr>
+        <w:t xml:space="preserve"> | </w:t>
+      </w:r>
+      <w:hyperlink r:id="rId12">
+        <w:r>
+          <w:rPr>
+            <w:rStyle w:val="Hyperlink"/>
+            <w:rFonts w:ascii="Times New Roman" w:hAnsi="Times New Roman"/>
           </w:rPr>
           <w:t>LinkedIn</w:t>
         </w:r>
       </w:hyperlink>
       <w:r>
         <w:rPr>
-          <w:rFonts w:ascii="Times New Roman" w:hAnsi="Times New Roman" w:cs="Times New Roman" w:hint="eastAsia"/>
-        </w:rPr>
-        <w:t xml:space="preserve"> </w:t>
-      </w:r>
-      <w:r>
-        <w:rPr>
-          <w:rFonts w:ascii="Times New Roman" w:eastAsia="Times New Roman" w:hAnsi="Times New Roman" w:cs="Times New Roman"/>
-        </w:rPr>
-        <w:t>| GitHub | Portfolio</w:t>
-      </w:r>
+          <w:rFonts w:ascii="Times New Roman" w:hAnsi="Times New Roman"/>
+        </w:rPr>
+        <w:t xml:space="preserve"> | </w:t>
+      </w:r>
+      <w:hyperlink r:id="rId13">
+        <w:r>
+          <w:rPr>
+            <w:rStyle w:val="Hyperlink"/>
+            <w:rFonts w:ascii="Times New Roman" w:hAnsi="Times New Roman"/>
+          </w:rPr>
+          <w:t>GitHub</w:t>
+        </w:r>
+      </w:hyperlink>
+      <w:r>
+        <w:rPr>
+          <w:rFonts w:ascii="Times New Roman" w:hAnsi="Times New Roman"/>
+        </w:rPr>
+        <w:t xml:space="preserve"> | </w:t>
+      </w:r>
+      <w:hyperlink r:id="rId14">
+        <w:r>
+          <w:rPr>
+            <w:rStyle w:val="Hyperlink"/>
+            <w:rFonts w:ascii="Times New Roman" w:hAnsi="Times New Roman"/>
+          </w:rPr>
+          <w:t>Portfolio</w:t>
+        </w:r>
+      </w:hyperlink>
     </w:p>
     <w:p>
       <w:pPr>

</xml_diff>

<commit_message>
Fix visible resume hyperlinks
</commit_message>
<xml_diff>
--- a/assets/Tan-Chun_Wang_Resume.docx
+++ b/assets/Tan-Chun_Wang_Resume.docx
@@ -62,6 +62,8 @@
         <w:r>
           <w:rPr>
             <w:rStyle w:val="Hyperlink"/>
+            <w:color w:val="0563C1"/>
+            <w:u w:val="single"/>
             <w:rFonts w:ascii="Times New Roman" w:hAnsi="Times New Roman"/>
           </w:rPr>
           <w:t>ginaintas@gmail.com</w:t>
@@ -77,6 +79,8 @@
         <w:r>
           <w:rPr>
             <w:rStyle w:val="Hyperlink"/>
+            <w:color w:val="0563C1"/>
+            <w:u w:val="single"/>
             <w:rFonts w:ascii="Times New Roman" w:hAnsi="Times New Roman"/>
           </w:rPr>
           <w:t>LinkedIn</w:t>
@@ -92,6 +96,8 @@
         <w:r>
           <w:rPr>
             <w:rStyle w:val="Hyperlink"/>
+            <w:color w:val="0563C1"/>
+            <w:u w:val="single"/>
             <w:rFonts w:ascii="Times New Roman" w:hAnsi="Times New Roman"/>
           </w:rPr>
           <w:t>GitHub</w:t>
@@ -107,6 +113,8 @@
         <w:r>
           <w:rPr>
             <w:rStyle w:val="Hyperlink"/>
+            <w:color w:val="0563C1"/>
+            <w:u w:val="single"/>
             <w:rFonts w:ascii="Times New Roman" w:hAnsi="Times New Roman"/>
           </w:rPr>
           <w:t>Portfolio</w:t>

</xml_diff>